<commit_message>
Remove explicit Peterson and Pageau references
</commit_message>
<xml_diff>
--- a/notes/session-01-notes.docx
+++ b/notes/session-01-notes.docx
@@ -801,7 +801,7 @@
           <w:sz w:val="22"/>
           <w:szCs w:val="22"/>
         </w:rPr>
-        <w:t xml:space="preserve">The Greek word Logos meant word, reason, the ordering principle of the cosmos; Greek philosophers had sought it for centuries. John's claim is that the Logos is not a force but a Person, that he was with God and was God, and that he became flesh. This is the keystone of the whole course: if all things were made through him, his pattern is stamped on everything, including the stories we cannot stop telling. The slide closes with the two ideas that will carry the whole course, and they are deliberately unattributed this week: reality is patterned and the pattern is meaningful, and every human life is lived on the border between order and chaos. Let them land on their own merit tonight. Session 2 names the two thinkers they came from, which is the right order: the class should find the ideas convincing before it is told whose they are.</w:t>
+        <w:t>The Greek word Logos meant word, reason, the ordering principle of the cosmos; Greek philosophers had sought it for centuries. John's claim is that the Logos is not a force but a Person, that he was with God and was God, and that he became flesh. This is the keystone of the whole course: if all things were made through him, his pattern is stamped on everything, including the stories we cannot stop telling. Close with the two ideas that carry the course: reality is patterned and meaningful, and human beings navigate between the familiar and the unknown through story. Session 2 brings these observations together under John 1: the world and the human heart came through the same Logos.</w:t>
       </w:r>
     </w:p>
     <w:p>
@@ -1202,25 +1202,25 @@
           <w:sz w:val="22"/>
           <w:szCs w:val="22"/>
         </w:rPr>
-        <w:t xml:space="preserve">Jonathan Pageau (The Symbolic World) argues that reality is patterned: heaven and earth, order and chaos, center and periphery, and that Scripture reveals this structure rather than merely containing rules and history. Session 1 is the course's version of that claim. His name is pronounced roughly pa-ZHOH, and he is an Eastern Orthodox Christian. Neither fact is on the slides this week by design; session 2 introduces him to the class properly and carries the fuller treatment, including how to speak about a tradition that is not ours.</w:t>
-      </w:r>
-    </w:p>
-    <w:p>
-      <w:pPr>
-        <w:pStyle w:val="ListParagraph"/>
-        <w:numPr>
-          <w:ilvl w:val="0"/>
-          <w:numId w:val="2"/>
-        </w:numPr>
-        <w:spacing w:after="100" w:line="290"/>
-      </w:pPr>
-      <w:r>
-        <w:rPr>
-          <w:rFonts w:ascii="Georgia" w:cs="Georgia" w:eastAsia="Georgia" w:hAnsi="Georgia"/>
-          <w:sz w:val="22"/>
-          <w:szCs w:val="22"/>
-        </w:rPr>
-        <w:t xml:space="preserve">Jordan B. Peterson (Maps of Meaning: The Architecture of Belief) describes human experience as lived on the border between order (the known) and chaos (the unknown), with archetypal stories serving as maps for crossing that border. His account is psychological; the course affirms his observations and presses further: the map is accurate because there is a Mapmaker. Where Peterson treats biblical events primarily as archetype, we affirm them as history as well; name that divergence plainly and kindly if it comes up. He is likewise unnamed on the slides this week and introduced in session 2, where the notes also cover what to do if his public reputation walks into the room ahead of his ideas.</w:t>
+        <w:t>Scripture reveals a patterned reality: heaven and earth, order and chaos, center and periphery. These are ways of noticing relationships already present in the text, not a code imposed on it. Session 1 begins with God separating, naming, and filling in Genesis 1, then identifies the Word through whom all things were made in John 1.</w:t>
+      </w:r>
+    </w:p>
+    <w:p>
+      <w:pPr>
+        <w:pStyle w:val="ListParagraph"/>
+        <w:numPr>
+          <w:ilvl w:val="0"/>
+          <w:numId w:val="2"/>
+        </w:numPr>
+        <w:spacing w:after="100" w:line="290"/>
+      </w:pPr>
+      <w:r>
+        <w:rPr>
+          <w:rFonts w:ascii="Georgia" w:cs="Georgia" w:eastAsia="Georgia" w:hAnsi="Georgia"/>
+          <w:sz w:val="22"/>
+          <w:szCs w:val="22"/>
+        </w:rPr>
+        <w:t>Human experience unfolds between order (the known) and chaos (the unknown). Enduring stories help us recognize that terrain and act within it. Their usefulness is one part of the course's claim; the deeper ground is that the map is accurate because there is a Mapmaker. Biblical events reveal these patterns as real history, not merely as pictures of psychological experience.</w:t>
       </w:r>
     </w:p>
     <w:p>

</xml_diff>

<commit_message>
Improve presentation readability and teaching controls with synced notes
</commit_message>
<xml_diff>
--- a/notes/session-01-notes.docx
+++ b/notes/session-01-notes.docx
@@ -37,7 +37,7 @@
     </w:p>
     <w:p>
       <w:pPr>
-        <w:spacing w:after="160" w:line="300"/>
+        <w:spacing w:after="120" w:line="300"/>
       </w:pPr>
       <w:r>
         <w:rPr>
@@ -51,7 +51,7 @@
     </w:p>
     <w:p>
       <w:pPr>
-        <w:spacing w:after="160" w:line="300"/>
+        <w:spacing w:after="120" w:line="300"/>
       </w:pPr>
       <w:r>
         <w:rPr>
@@ -75,9 +75,19 @@
       </w:r>
     </w:p>
     <w:p>
+      <w:pPr/>
+      <w:r>
+        <w:rPr>
+          <w:rFonts w:ascii="Georgia" w:hAnsi="Georgia"/>
+          <w:sz w:val="22"/>
+        </w:rPr>
+        <w:t>Presentation controls: Use Slides to jump directly to a numbered slide, Notes to open this document, F for fullscreen, and B to blank or restore the screen. Resume teaching on the home screen returns to the last saved position in this browser. On-screen slide numbers match these notes. Keep private notes on a separate device or display.</w:t>
+      </w:r>
+    </w:p>
+    <w:p>
       <w:pPr>
         <w:pStyle w:val="Heading1"/>
-        <w:spacing w:after="160" w:before="360"/>
+        <w:spacing w:after="120" w:before="360"/>
       </w:pPr>
       <w:r>
         <w:rPr>
@@ -202,7 +212,7 @@
     <w:p>
       <w:pPr>
         <w:pStyle w:val="Heading1"/>
-        <w:spacing w:after="160" w:before="360"/>
+        <w:spacing w:after="120" w:before="360"/>
       </w:pPr>
       <w:r>
         <w:rPr>
@@ -303,7 +313,7 @@
     <w:p>
       <w:pPr>
         <w:pStyle w:val="Heading1"/>
-        <w:spacing w:after="160" w:before="360"/>
+        <w:spacing w:after="120" w:before="360"/>
       </w:pPr>
       <w:r>
         <w:rPr>
@@ -319,7 +329,7 @@
     </w:p>
     <w:p>
       <w:pPr>
-        <w:spacing w:after="160" w:line="300"/>
+        <w:spacing w:after="120" w:line="300"/>
       </w:pPr>
       <w:r>
         <w:rPr>
@@ -343,7 +353,7 @@
     </w:p>
     <w:p>
       <w:pPr>
-        <w:spacing w:after="160" w:line="300"/>
+        <w:spacing w:after="120" w:line="300"/>
       </w:pPr>
       <w:r>
         <w:rPr>
@@ -367,7 +377,7 @@
     </w:p>
     <w:p>
       <w:pPr>
-        <w:spacing w:after="160" w:line="300"/>
+        <w:spacing w:after="120" w:line="300"/>
       </w:pPr>
       <w:r>
         <w:rPr>
@@ -391,7 +401,7 @@
     </w:p>
     <w:p>
       <w:pPr>
-        <w:spacing w:after="160" w:line="300"/>
+        <w:spacing w:after="120" w:line="300"/>
       </w:pPr>
       <w:r>
         <w:rPr>
@@ -415,7 +425,7 @@
     </w:p>
     <w:p>
       <w:pPr>
-        <w:spacing w:after="160" w:line="300"/>
+        <w:spacing w:after="120" w:line="300"/>
       </w:pPr>
       <w:r>
         <w:rPr>
@@ -439,7 +449,7 @@
     </w:p>
     <w:p>
       <w:pPr>
-        <w:spacing w:after="160" w:line="300"/>
+        <w:spacing w:after="120" w:line="300"/>
       </w:pPr>
       <w:r>
         <w:rPr>
@@ -463,7 +473,7 @@
     </w:p>
     <w:p>
       <w:pPr>
-        <w:spacing w:after="160" w:line="300"/>
+        <w:spacing w:after="120" w:line="300"/>
       </w:pPr>
       <w:r>
         <w:rPr>
@@ -487,7 +497,7 @@
     </w:p>
     <w:p>
       <w:pPr>
-        <w:spacing w:after="160" w:line="300"/>
+        <w:spacing w:after="120" w:line="300"/>
       </w:pPr>
       <w:r>
         <w:rPr>
@@ -511,7 +521,7 @@
     </w:p>
     <w:p>
       <w:pPr>
-        <w:spacing w:after="160" w:line="300"/>
+        <w:spacing w:after="120" w:line="300"/>
       </w:pPr>
       <w:r>
         <w:rPr>
@@ -535,7 +545,7 @@
     </w:p>
     <w:p>
       <w:pPr>
-        <w:spacing w:after="160" w:line="300"/>
+        <w:spacing w:after="120" w:line="300"/>
       </w:pPr>
       <w:r>
         <w:rPr>
@@ -560,7 +570,7 @@
     <w:p>
       <w:pPr>
         <w:pStyle w:val="Heading1"/>
-        <w:spacing w:after="160" w:before="360"/>
+        <w:spacing w:after="120" w:before="360"/>
       </w:pPr>
       <w:r>
         <w:rPr>
@@ -575,8 +585,9 @@
       </w:r>
     </w:p>
     <w:p>
-      <w:pPr>
-        <w:spacing w:after="160" w:line="300"/>
+      <w:bookmarkStart w:id="1001" w:name="s01_the_world_has_a_shape"/>
+      <w:pPr>
+        <w:spacing w:after="120" w:line="300"/>
       </w:pPr>
       <w:r>
         <w:rPr>
@@ -596,10 +607,12 @@
         </w:rPr>
         <w:t xml:space="preserve">Welcome them into the series, not just the session. One sentence on the premise: the stories we love keep telling us the same thing because it is true, and Scripture tells it first and best.</w:t>
       </w:r>
-    </w:p>
-    <w:p>
-      <w:pPr>
-        <w:spacing w:after="160" w:line="300"/>
+      <w:bookmarkEnd w:id="1001"/>
+    </w:p>
+    <w:p>
+      <w:bookmarkStart w:id="1002" w:name="s01_story_openings"/>
+      <w:pPr>
+        <w:spacing w:after="120" w:line="300"/>
       </w:pPr>
       <w:r>
         <w:rPr>
@@ -619,10 +632,12 @@
         </w:rPr>
         <w:t xml:space="preserve">Read all three openings aloud, slowly, with relish. Then ask the question on the slide and wait. Let a few people answer before moving on. The honest answer is that nobody taught us to lean in; we just do.</w:t>
       </w:r>
-    </w:p>
-    <w:p>
-      <w:pPr>
-        <w:spacing w:after="160" w:line="300"/>
+      <w:bookmarkEnd w:id="1002"/>
+    </w:p>
+    <w:p>
+      <w:bookmarkStart w:id="1003" w:name="s01_every_enduring_story_opens_onto_the_"/>
+      <w:pPr>
+        <w:spacing w:after="120" w:line="300"/>
       </w:pPr>
       <w:r>
         <w:rPr>
@@ -642,10 +657,12 @@
         </w:rPr>
         <w:t xml:space="preserve">Every enduring story opens onto the same map: a warm lit ordered place and a dark unknown surrounding it. Invite quick examples from the room before showing yours.</w:t>
       </w:r>
-    </w:p>
-    <w:p>
-      <w:pPr>
-        <w:spacing w:after="160" w:line="300"/>
+      <w:bookmarkEnd w:id="1003"/>
+    </w:p>
+    <w:p>
+      <w:bookmarkStart w:id="1004" w:name="s01_reality_has_a_shape_and_every_true_s"/>
+      <w:pPr>
+        <w:spacing w:after="120" w:line="300"/>
       </w:pPr>
       <w:r>
         <w:rPr>
@@ -665,10 +682,12 @@
         </w:rPr>
         <w:t xml:space="preserve">Say the sentence of the week together, out loud, even if it feels a little corny. Repetition is how the course builds its spine. Each week adds one sentence.</w:t>
       </w:r>
-    </w:p>
-    <w:p>
-      <w:pPr>
-        <w:spacing w:after="160" w:line="300"/>
+      <w:bookmarkEnd w:id="1004"/>
+    </w:p>
+    <w:p>
+      <w:bookmarkStart w:id="1005" w:name="s01_the_lit_clearing_and_the_dark_wood"/>
+      <w:pPr>
+        <w:spacing w:after="120" w:line="300"/>
       </w:pPr>
       <w:r>
         <w:rPr>
@@ -688,10 +707,12 @@
         </w:rPr>
         <w:t xml:space="preserve">Walk the pairs on screen. The key line is at the bottom: order is where things have names and places; chaos is where they do not, yet. The word 'yet' matters; chaos is not evil in itself, it is the not-yet-ordered, and it is also where treasure and calling wait. That nuance returns in later sessions.</w:t>
       </w:r>
-    </w:p>
-    <w:p>
-      <w:pPr>
-        <w:spacing w:after="160" w:line="300"/>
+      <w:bookmarkEnd w:id="1005"/>
+    </w:p>
+    <w:p>
+      <w:bookmarkStart w:id="1006" w:name="s01_here_be_dragons"/>
+      <w:pPr>
+        <w:spacing w:after="120" w:line="300"/>
       </w:pPr>
       <w:r>
         <w:rPr>
@@ -711,10 +732,12 @@
         </w:rPr>
         <w:t xml:space="preserve">Old maps put dragons at the edge of the known. Scripture is unafraid of this creature and names it: the deep (Genesis 1:2), the serpent (Genesis 3), Leviathan (Job 41). The Bible is not borrowing from pagan myth so much as telling the truth the myths were groping toward.</w:t>
       </w:r>
-    </w:p>
-    <w:p>
-      <w:pPr>
-        <w:spacing w:after="160" w:line="300"/>
+      <w:bookmarkEnd w:id="1006"/>
+    </w:p>
+    <w:p>
+      <w:bookmarkStart w:id="1007" w:name="s01_genesis_1_1_2_niv"/>
+      <w:pPr>
+        <w:spacing w:after="120" w:line="300"/>
       </w:pPr>
       <w:r>
         <w:rPr>
@@ -734,10 +757,12 @@
         </w:rPr>
         <w:t xml:space="preserve">Read it aloud. Point out the shape of the first act: darkness, formlessness, emptiness, and the Spirit hovering. Then God speaks, and speech itself separates, names, and fills. Creation in Genesis 1 is order called out of chaos by a voice. The next slide opens up the two Hebrew words sitting under 'formless and empty'.</w:t>
       </w:r>
-    </w:p>
-    <w:p>
-      <w:pPr>
-        <w:spacing w:after="160" w:line="300"/>
+      <w:bookmarkEnd w:id="1007"/>
+    </w:p>
+    <w:p>
+      <w:bookmarkStart w:id="1008" w:name="s01_tohu_va_bohu"/>
+      <w:pPr>
+        <w:spacing w:after="120" w:line="300"/>
       </w:pPr>
       <w:r>
         <w:rPr>
@@ -757,10 +782,12 @@
         </w:rPr>
         <w:t xml:space="preserve">Say it out loud and have the room say it back. It is enjoyable to pronounce and they will remember it. The Hebrew behind 'formless and empty' is tohu va-bohu, a rhyming pair that works in Hebrew the way 'helter-skelter' and 'topsy-turvy' work in English. Tohu means trackless waste, a wilderness with no shape to it; bohu means empty, unfilled. Robert Alter translates the pair 'welter and waste', and the KJV has 'without form, and void'. Then walk the structure on the slide, which is the real payoff: Genesis states the problem in two words and answers it in two movements. Days one to three separate and form, light from dark, waters above from waters below, sea from dry land, and that answers the tohu. Days four to six fill what was formed, sun and moon and stars, fish and birds, animals and people, and that answers the bohu. God does not simply tidy the chaos; he makes room, and then he fills the room. Close with Jeremiah 4:23, where the prophet looks at a land under judgment and sees tohu va-bohu again. The same two words, the world running backward. That is what sin does to a good creation, and it sets up sessions 5 through 7.</w:t>
       </w:r>
-    </w:p>
-    <w:p>
-      <w:pPr>
-        <w:spacing w:after="160" w:line="300"/>
+      <w:bookmarkEnd w:id="1008"/>
+    </w:p>
+    <w:p>
+      <w:bookmarkStart w:id="1009" w:name="s01_john_1_1_5_niv"/>
+      <w:pPr>
+        <w:spacing w:after="120" w:line="300"/>
       </w:pPr>
       <w:r>
         <w:rPr>
@@ -780,10 +807,12 @@
         </w:rPr>
         <w:t xml:space="preserve">Read it aloud and let the echo of Genesis land: In the beginning. John is deliberately rewriting the opening line of the Bible around a Person.</w:t>
       </w:r>
-    </w:p>
-    <w:p>
-      <w:pPr>
-        <w:spacing w:after="160" w:line="300"/>
+      <w:bookmarkEnd w:id="1009"/>
+    </w:p>
+    <w:p>
+      <w:bookmarkStart w:id="1010" w:name="s01_the_logos"/>
+      <w:pPr>
+        <w:spacing w:after="120" w:line="300"/>
       </w:pPr>
       <w:r>
         <w:rPr>
@@ -803,10 +832,34 @@
         </w:rPr>
         <w:t>The Greek word Logos meant word, reason, the ordering principle of the cosmos; Greek philosophers had sought it for centuries. John's claim is that the Logos is not a force but a Person, that he was with God and was God, and that he became flesh. This is the keystone of the whole course: if all things were made through him, his pattern is stamped on everything, including the stories we cannot stop telling. Close with the two ideas that carry the course: reality is patterned and meaningful, and human beings navigate between the familiar and the unknown through story. Session 2 brings these observations together under John 1: the world and the human heart came through the same Logos.</w:t>
       </w:r>
-    </w:p>
-    <w:p>
-      <w:pPr>
-        <w:spacing w:after="160" w:line="300"/>
+      <w:bookmarkEnd w:id="1010"/>
+      <w:r>
+        <w:rPr>
+          <w:rFonts w:ascii="Georgia" w:hAnsi="Georgia"/>
+          <w:b/>
+          <w:sz w:val="22"/>
+        </w:rPr>
+        <w:t xml:space="preserve"> Expanded explanation retained from the presentation: </w:t>
+      </w:r>
+      <w:r>
+        <w:rPr>
+          <w:rFonts w:ascii="Georgia" w:hAnsi="Georgia"/>
+          <w:sz w:val="22"/>
+        </w:rPr>
+        <w:t>John wrote in Greek, and the word he chose was Logos: word, reason, the ordering principle that makes the cosmos hang together. The Greeks had been searching for it for centuries. John's staggering claim: the order of the world is not a force. It is a Person. And the Person took on flesh and moved into the neighborhood. Two ideas will follow us for eleven weeks. Reality is patterned, and the pattern is meaningful. And every human life is lived on the border between order and chaos, with stories as our maps. John goes further than either: the Mapmaker has stepped onto the map.</w:t>
+      </w:r>
+      <w:r>
+        <w:rPr>
+          <w:rFonts w:ascii="Georgia" w:hAnsi="Georgia"/>
+          <w:sz w:val="22"/>
+        </w:rPr>
+        <w:t xml:space="preserve"> Teaching cue: The projected slide now carries three short thoughts. Use this fuller explanation aloud within the existing time allocation.</w:t>
+      </w:r>
+    </w:p>
+    <w:p>
+      <w:bookmarkStart w:id="1011" w:name="s01_the_light_shines_in_the_darkness_and"/>
+      <w:pPr>
+        <w:spacing w:after="120" w:line="300"/>
       </w:pPr>
       <w:r>
         <w:rPr>
@@ -826,10 +879,12 @@
         </w:rPr>
         <w:t xml:space="preserve">Slow down here. Everyone in the room has somewhere life feels formless and empty. The claim of John 1:5 is not that darkness is not real but that it has not, and will not, overcome the light.</w:t>
       </w:r>
-    </w:p>
-    <w:p>
-      <w:pPr>
-        <w:spacing w:after="160" w:line="300"/>
+      <w:bookmarkEnd w:id="1011"/>
+    </w:p>
+    <w:p>
+      <w:bookmarkStart w:id="1012" w:name="s01_where_do_you_see_order_and_chaos"/>
+      <w:pPr>
+        <w:spacing w:after="120" w:line="300"/>
       </w:pPr>
       <w:r>
         <w:rPr>
@@ -849,10 +904,19 @@
         </w:rPr>
         <w:t xml:space="preserve">Start with a Starter question to warm the room. Do not rush to fill silence; this group is capable of real thought if you give it room.</w:t>
       </w:r>
-    </w:p>
-    <w:p>
-      <w:pPr>
-        <w:spacing w:after="160" w:line="300"/>
+      <w:bookmarkEnd w:id="1012"/>
+      <w:r>
+        <w:rPr>
+          <w:rFonts w:ascii="Georgia" w:hAnsi="Georgia"/>
+          <w:sz w:val="22"/>
+        </w:rPr>
+        <w:t xml:space="preserve"> Presentation cue: Questions appear one at a time on this same numbered slide. Next and Back move between questions before changing slides. Use Show all to choose from the full set, then Show one to focus the room. Keep the existing discussion time; you do not need to ask every question.</w:t>
+      </w:r>
+    </w:p>
+    <w:p>
+      <w:bookmarkStart w:id="1013" w:name="s01_the_world_has_a_shape_and_the_shape_"/>
+      <w:pPr>
+        <w:spacing w:after="120" w:line="300"/>
       </w:pPr>
       <w:r>
         <w:rPr>
@@ -872,11 +936,12 @@
         </w:rPr>
         <w:t xml:space="preserve">The world has a shape, and the Shape has a name. Close in prayer, perhaps simply praying John 1:1-5 back to God.</w:t>
       </w:r>
+      <w:bookmarkEnd w:id="1013"/>
     </w:p>
     <w:p>
       <w:pPr>
         <w:pStyle w:val="Heading1"/>
-        <w:spacing w:after="160" w:before="360"/>
+        <w:spacing w:after="120" w:before="360"/>
       </w:pPr>
       <w:r>
         <w:rPr>
@@ -965,7 +1030,7 @@
     <w:p>
       <w:pPr>
         <w:pStyle w:val="Heading1"/>
-        <w:spacing w:after="160" w:before="360"/>
+        <w:spacing w:after="120" w:before="360"/>
       </w:pPr>
       <w:r>
         <w:rPr>
@@ -1142,7 +1207,7 @@
     <w:p>
       <w:pPr>
         <w:pStyle w:val="Heading1"/>
-        <w:spacing w:after="160" w:before="360"/>
+        <w:spacing w:after="120" w:before="360"/>
       </w:pPr>
       <w:r>
         <w:rPr>
@@ -1158,7 +1223,7 @@
     </w:p>
     <w:p>
       <w:pPr>
-        <w:spacing w:after="160" w:line="300"/>
+        <w:spacing w:after="120" w:line="300"/>
       </w:pPr>
       <w:r>
         <w:rPr>
@@ -1280,7 +1345,7 @@
     <w:p>
       <w:pPr>
         <w:pStyle w:val="Heading1"/>
-        <w:spacing w:after="160" w:before="360"/>
+        <w:spacing w:after="120" w:before="360"/>
       </w:pPr>
       <w:r>
         <w:rPr>
@@ -1296,7 +1361,7 @@
     </w:p>
     <w:p>
       <w:pPr>
-        <w:spacing w:after="160" w:line="300"/>
+        <w:spacing w:after="120" w:line="300"/>
       </w:pPr>
       <w:r>
         <w:rPr>
@@ -1309,7 +1374,7 @@
     </w:p>
     <w:p>
       <w:pPr>
-        <w:spacing w:after="160" w:line="300"/>
+        <w:spacing w:after="120" w:line="300"/>
       </w:pPr>
       <w:r>
         <w:rPr>
@@ -1323,7 +1388,7 @@
     <w:p>
       <w:pPr>
         <w:pStyle w:val="Heading1"/>
-        <w:spacing w:after="160" w:before="360"/>
+        <w:spacing w:after="120" w:before="360"/>
       </w:pPr>
       <w:r>
         <w:rPr>
@@ -1339,7 +1404,7 @@
     </w:p>
     <w:p>
       <w:pPr>
-        <w:spacing w:after="160" w:line="300"/>
+        <w:spacing w:after="120" w:line="300"/>
       </w:pPr>
       <w:r>
         <w:rPr>

</xml_diff>